<commit_message>
docs: actualiza documentos de defensa
</commit_message>
<xml_diff>
--- a/docs/defensa-guion.docx
+++ b/docs/defensa-guion.docx
@@ -167,7 +167,7 @@
           <w:sz w:val="18"/>
           <w:szCs w:val="18"/>
         </w:rPr>
-        <w:t xml:space="preserve">Slides asociadas: defensa-stockly.pptx (15 diapositivas + cierre)</w:t>
+        <w:t xml:space="preserve">Slides asociadas: defensa-stockly.pptx (17 diapositivas + cierre)</w:t>
       </w:r>
     </w:p>
     <w:p>
@@ -1140,7 +1140,7 @@
           <w:sz w:val="20"/>
           <w:szCs w:val="20"/>
         </w:rPr>
-        <w:t xml:space="preserve">Mostrar capturas.</w:t>
+        <w:t xml:space="preserve">Anticipar que las capturas reales vienen en las dos diapositivas siguientes.</w:t>
       </w:r>
     </w:p>
     <w:p>
@@ -1209,7 +1209,7 @@
           <w:sz w:val="28"/>
           <w:szCs w:val="28"/>
         </w:rPr>
-        <w:t xml:space="preserve">App Android nativa</w:t>
+        <w:t xml:space="preserve">Capturas web — cliente y catálogo</w:t>
       </w:r>
       <w:r>
         <w:rPr>
@@ -1218,7 +1218,23 @@
           <w:sz w:val="20"/>
           <w:szCs w:val="20"/>
         </w:rPr>
-        <w:t xml:space="preserve">   —   40 s</w:t>
+        <w:t xml:space="preserve">   —   25 s</w:t>
+      </w:r>
+    </w:p>
+    <w:p>
+      <w:pPr>
+        <w:spacing w:after="100" w:line="280"/>
+      </w:pPr>
+      <w:r>
+        <w:rPr>
+          <w:rFonts w:ascii="Calibri" w:cs="Calibri" w:eastAsia="Calibri" w:hAnsi="Calibri"/>
+          <w:i/>
+          <w:iCs/>
+          <w:color w:val="6B7280"/>
+          <w:sz w:val="20"/>
+          <w:szCs w:val="20"/>
+        </w:rPr>
+        <w:t xml:space="preserve">Recorrer las seis capturas de un vistazo.</w:t>
       </w:r>
     </w:p>
     <w:p>
@@ -1229,46 +1245,77 @@
         <w:rPr>
           <w:rFonts w:ascii="Calibri" w:cs="Calibri" w:eastAsia="Calibri" w:hAnsi="Calibri"/>
         </w:rPr>
-        <w:t xml:space="preserve">La app Android está pensada </w:t>
-      </w:r>
-      <w:r>
-        <w:rPr>
-          <w:rFonts w:ascii="Calibri" w:cs="Calibri" w:eastAsia="Calibri" w:hAnsi="Calibri"/>
-          <w:b/>
-          <w:bCs/>
-        </w:rPr>
-        <w:t xml:space="preserve">específicamente para el operario de almacén. </w:t>
-      </w:r>
-      <w:r>
-        <w:rPr>
-          <w:rFonts w:ascii="Calibri" w:cs="Calibri" w:eastAsia="Calibri" w:hAnsi="Calibri"/>
-        </w:rPr>
-        <w:t xml:space="preserve">Está construida con Jetpack Compose y consume la misma API que la web. Tiene cuatro pantallas: login, lista de reservas activas, detalle de la reserva con botones para confirmar y entregar, y un formulario de incidencias para reportar roturas, faltantes o pedidos en mal estado.</w:t>
-      </w:r>
-    </w:p>
-    <w:p>
-      <w:pPr>
-        <w:spacing w:after="120" w:line="300"/>
-      </w:pPr>
-      <w:r>
-        <w:rPr>
-          <w:rFonts w:ascii="Calibri" w:cs="Calibri" w:eastAsia="Calibri" w:hAnsi="Calibri"/>
-        </w:rPr>
-        <w:t xml:space="preserve">El JWT se guarda con EncryptedSharedPreferences cifrado contra el Android Keystore — </w:t>
-      </w:r>
-      <w:r>
-        <w:rPr>
-          <w:rFonts w:ascii="Calibri" w:cs="Calibri" w:eastAsia="Calibri" w:hAnsi="Calibri"/>
-          <w:b/>
-          <w:bCs/>
-        </w:rPr>
-        <w:t xml:space="preserve">nunca se escribe en texto plano. </w:t>
-      </w:r>
-      <w:r>
-        <w:rPr>
-          <w:rFonts w:ascii="Calibri" w:cs="Calibri" w:eastAsia="Calibri" w:hAnsi="Calibri"/>
-        </w:rPr>
-        <w:t xml:space="preserve">La sesión se mantiene entre arranques.</w:t>
+        <w:t xml:space="preserve">Aquí se ve la aplicación real en uso. De izquierda a derecha: el </w:t>
+      </w:r>
+      <w:r>
+        <w:rPr>
+          <w:rFonts w:ascii="Calibri" w:cs="Calibri" w:eastAsia="Calibri" w:hAnsi="Calibri"/>
+          <w:b/>
+          <w:bCs/>
+        </w:rPr>
+        <w:t xml:space="preserve">login con JWT, </w:t>
+      </w:r>
+      <w:r>
+        <w:rPr>
+          <w:rFonts w:ascii="Calibri" w:cs="Calibri" w:eastAsia="Calibri" w:hAnsi="Calibri"/>
+        </w:rPr>
+        <w:t xml:space="preserve">el </w:t>
+      </w:r>
+      <w:r>
+        <w:rPr>
+          <w:rFonts w:ascii="Calibri" w:cs="Calibri" w:eastAsia="Calibri" w:hAnsi="Calibri"/>
+          <w:b/>
+          <w:bCs/>
+        </w:rPr>
+        <w:t xml:space="preserve">catálogo con búsqueda y filtros, </w:t>
+      </w:r>
+      <w:r>
+        <w:rPr>
+          <w:rFonts w:ascii="Calibri" w:cs="Calibri" w:eastAsia="Calibri" w:hAnsi="Calibri"/>
+        </w:rPr>
+        <w:t xml:space="preserve">el detalle de un producto con su modal de reserva, la vista de </w:t>
+      </w:r>
+      <w:r>
+        <w:rPr>
+          <w:rFonts w:ascii="Calibri" w:cs="Calibri" w:eastAsia="Calibri" w:hAnsi="Calibri"/>
+          <w:b/>
+          <w:bCs/>
+        </w:rPr>
+        <w:t xml:space="preserve">"mis reservas" </w:t>
+      </w:r>
+      <w:r>
+        <w:rPr>
+          <w:rFonts w:ascii="Calibri" w:cs="Calibri" w:eastAsia="Calibri" w:hAnsi="Calibri"/>
+        </w:rPr>
+        <w:t xml:space="preserve">del cliente, la </w:t>
+      </w:r>
+      <w:r>
+        <w:rPr>
+          <w:rFonts w:ascii="Calibri" w:cs="Calibri" w:eastAsia="Calibri" w:hAnsi="Calibri"/>
+          <w:b/>
+          <w:bCs/>
+        </w:rPr>
+        <w:t xml:space="preserve">cola de reservas </w:t>
+      </w:r>
+      <w:r>
+        <w:rPr>
+          <w:rFonts w:ascii="Calibri" w:cs="Calibri" w:eastAsia="Calibri" w:hAnsi="Calibri"/>
+        </w:rPr>
+        <w:t xml:space="preserve">que ve el operario, y el </w:t>
+      </w:r>
+      <w:r>
+        <w:rPr>
+          <w:rFonts w:ascii="Calibri" w:cs="Calibri" w:eastAsia="Calibri" w:hAnsi="Calibri"/>
+          <w:b/>
+          <w:bCs/>
+        </w:rPr>
+        <w:t xml:space="preserve">dashboard de KPIs </w:t>
+      </w:r>
+      <w:r>
+        <w:rPr>
+          <w:rFonts w:ascii="Calibri" w:cs="Calibri" w:eastAsia="Calibri" w:hAnsi="Calibri"/>
+        </w:rPr>
+        <w:t xml:space="preserve">del administrador.</w:t>
       </w:r>
     </w:p>
     <w:p>
@@ -1298,7 +1345,7 @@
           <w:sz w:val="28"/>
           <w:szCs w:val="28"/>
         </w:rPr>
-        <w:t xml:space="preserve">Despliegue</w:t>
+        <w:t xml:space="preserve">Capturas web — administración y PWA</w:t>
       </w:r>
       <w:r>
         <w:rPr>
@@ -1307,7 +1354,23 @@
           <w:sz w:val="20"/>
           <w:szCs w:val="20"/>
         </w:rPr>
-        <w:t xml:space="preserve">   —   30 s</w:t>
+        <w:t xml:space="preserve">   —   20 s</w:t>
+      </w:r>
+    </w:p>
+    <w:p>
+      <w:pPr>
+        <w:spacing w:after="100" w:line="280"/>
+      </w:pPr>
+      <w:r>
+        <w:rPr>
+          <w:rFonts w:ascii="Calibri" w:cs="Calibri" w:eastAsia="Calibri" w:hAnsi="Calibri"/>
+          <w:i/>
+          <w:iCs/>
+          <w:color w:val="6B7280"/>
+          <w:sz w:val="20"/>
+          <w:szCs w:val="20"/>
+        </w:rPr>
+        <w:t xml:space="preserve">Cuatro capturas: gestión y experiencia.</w:t>
       </w:r>
     </w:p>
     <w:p>
@@ -1318,32 +1381,63 @@
         <w:rPr>
           <w:rFonts w:ascii="Calibri" w:cs="Calibri" w:eastAsia="Calibri" w:hAnsi="Calibri"/>
         </w:rPr>
-        <w:t xml:space="preserve">El sistema está en producción en </w:t>
-      </w:r>
-      <w:r>
-        <w:rPr>
-          <w:rFonts w:ascii="Calibri" w:cs="Calibri" w:eastAsia="Calibri" w:hAnsi="Calibri"/>
-          <w:b/>
-          <w:bCs/>
-        </w:rPr>
-        <w:t xml:space="preserve">Railway: </w:t>
-      </w:r>
-      <w:r>
-        <w:rPr>
-          <w:rFonts w:ascii="Calibri" w:cs="Calibri" w:eastAsia="Calibri" w:hAnsi="Calibri"/>
-        </w:rPr>
-        <w:t xml:space="preserve">backend Node.js y MySQL gestionado, con HTTPS automático y deploy continuo desde GitHub. Cada push a main dispara un redespliegue. El esquema de base de datos se aplica solo la primera vez —si las tablas están vacías— para que los redespliegues no pisen datos reales.</w:t>
-      </w:r>
-    </w:p>
-    <w:p>
-      <w:pPr>
-        <w:spacing w:after="120" w:before="0" w:line="300"/>
-      </w:pPr>
-      <w:r>
-        <w:rPr>
-          <w:rFonts w:ascii="Calibri" w:cs="Calibri" w:eastAsia="Calibri" w:hAnsi="Calibri"/>
-        </w:rPr>
-        <w:t xml:space="preserve">La URL pública está en la última diapositiva y al final de la demo.</w:t>
+        <w:t xml:space="preserve">Y estas cuatro cierran la parte web: el </w:t>
+      </w:r>
+      <w:r>
+        <w:rPr>
+          <w:rFonts w:ascii="Calibri" w:cs="Calibri" w:eastAsia="Calibri" w:hAnsi="Calibri"/>
+          <w:b/>
+          <w:bCs/>
+        </w:rPr>
+        <w:t xml:space="preserve">inventario </w:t>
+      </w:r>
+      <w:r>
+        <w:rPr>
+          <w:rFonts w:ascii="Calibri" w:cs="Calibri" w:eastAsia="Calibri" w:hAnsi="Calibri"/>
+        </w:rPr>
+        <w:t xml:space="preserve">con la alerta de stock bajo resaltada, la </w:t>
+      </w:r>
+      <w:r>
+        <w:rPr>
+          <w:rFonts w:ascii="Calibri" w:cs="Calibri" w:eastAsia="Calibri" w:hAnsi="Calibri"/>
+          <w:b/>
+          <w:bCs/>
+        </w:rPr>
+        <w:t xml:space="preserve">gestión de usuarios </w:t>
+      </w:r>
+      <w:r>
+        <w:rPr>
+          <w:rFonts w:ascii="Calibri" w:cs="Calibri" w:eastAsia="Calibri" w:hAnsi="Calibri"/>
+        </w:rPr>
+        <w:t xml:space="preserve">del administrador, el </w:t>
+      </w:r>
+      <w:r>
+        <w:rPr>
+          <w:rFonts w:ascii="Calibri" w:cs="Calibri" w:eastAsia="Calibri" w:hAnsi="Calibri"/>
+          <w:b/>
+          <w:bCs/>
+        </w:rPr>
+        <w:t xml:space="preserve">modo oscuro, </w:t>
+      </w:r>
+      <w:r>
+        <w:rPr>
+          <w:rFonts w:ascii="Calibri" w:cs="Calibri" w:eastAsia="Calibri" w:hAnsi="Calibri"/>
+        </w:rPr>
+        <w:t xml:space="preserve">y la pantalla de </w:t>
+      </w:r>
+      <w:r>
+        <w:rPr>
+          <w:rFonts w:ascii="Calibri" w:cs="Calibri" w:eastAsia="Calibri" w:hAnsi="Calibri"/>
+          <w:b/>
+          <w:bCs/>
+        </w:rPr>
+        <w:t xml:space="preserve">descarga del APK Android </w:t>
+      </w:r>
+      <w:r>
+        <w:rPr>
+          <w:rFonts w:ascii="Calibri" w:cs="Calibri" w:eastAsia="Calibri" w:hAnsi="Calibri"/>
+        </w:rPr>
+        <w:t xml:space="preserve">directamente desde la web. Todo esto está accesible en producción ahora mismo.</w:t>
       </w:r>
     </w:p>
     <w:p>
@@ -1373,7 +1467,7 @@
           <w:sz w:val="28"/>
           <w:szCs w:val="28"/>
         </w:rPr>
-        <w:t xml:space="preserve">Pruebas y resultados</w:t>
+        <w:t xml:space="preserve">App Android nativa</w:t>
       </w:r>
       <w:r>
         <w:rPr>
@@ -1393,35 +1487,21 @@
         <w:rPr>
           <w:rFonts w:ascii="Calibri" w:cs="Calibri" w:eastAsia="Calibri" w:hAnsi="Calibri"/>
         </w:rPr>
-        <w:t xml:space="preserve">Tests automatizados con </w:t>
-      </w:r>
-      <w:r>
-        <w:rPr>
-          <w:rFonts w:ascii="Calibri" w:cs="Calibri" w:eastAsia="Calibri" w:hAnsi="Calibri"/>
-          <w:b/>
-          <w:bCs/>
-        </w:rPr>
-        <w:t xml:space="preserve">Vitest + Supertest </w:t>
-      </w:r>
-      <w:r>
-        <w:rPr>
-          <w:rFonts w:ascii="Calibri" w:cs="Calibri" w:eastAsia="Calibri" w:hAnsi="Calibri"/>
-        </w:rPr>
-        <w:t xml:space="preserve">sobre los flujos críticos: autenticación, CRUD de productos con autorización por rol, y el caso de </w:t>
-      </w:r>
-      <w:r>
-        <w:rPr>
-          <w:rFonts w:ascii="Calibri" w:cs="Calibri" w:eastAsia="Calibri" w:hAnsi="Calibri"/>
-          <w:b/>
-          <w:bCs/>
-        </w:rPr>
-        <w:t xml:space="preserve">concurrencia simulada </w:t>
-      </w:r>
-      <w:r>
-        <w:rPr>
-          <w:rFonts w:ascii="Calibri" w:cs="Calibri" w:eastAsia="Calibri" w:hAnsi="Calibri"/>
-        </w:rPr>
-        <w:t xml:space="preserve">que mencionábamos antes.</w:t>
+        <w:t xml:space="preserve">La app Android está pensada </w:t>
+      </w:r>
+      <w:r>
+        <w:rPr>
+          <w:rFonts w:ascii="Calibri" w:cs="Calibri" w:eastAsia="Calibri" w:hAnsi="Calibri"/>
+          <w:b/>
+          <w:bCs/>
+        </w:rPr>
+        <w:t xml:space="preserve">específicamente para el operario de almacén. </w:t>
+      </w:r>
+      <w:r>
+        <w:rPr>
+          <w:rFonts w:ascii="Calibri" w:cs="Calibri" w:eastAsia="Calibri" w:hAnsi="Calibri"/>
+        </w:rPr>
+        <w:t xml:space="preserve">Está construida con Jetpack Compose y consume la misma API que la web. Tiene cuatro pantallas: login, lista de reservas activas, detalle de la reserva con botones para confirmar y entregar, y un formulario de incidencias para reportar roturas, faltantes o pedidos en mal estado.</w:t>
       </w:r>
     </w:p>
     <w:p>
@@ -1432,35 +1512,21 @@
         <w:rPr>
           <w:rFonts w:ascii="Calibri" w:cs="Calibri" w:eastAsia="Calibri" w:hAnsi="Calibri"/>
         </w:rPr>
-        <w:t xml:space="preserve">Resultado funcional: un catálogo con </w:t>
-      </w:r>
-      <w:r>
-        <w:rPr>
-          <w:rFonts w:ascii="Calibri" w:cs="Calibri" w:eastAsia="Calibri" w:hAnsi="Calibri"/>
-          <w:b/>
-          <w:bCs/>
-        </w:rPr>
-        <w:t xml:space="preserve">500 productos </w:t>
-      </w:r>
-      <w:r>
-        <w:rPr>
-          <w:rFonts w:ascii="Calibri" w:cs="Calibri" w:eastAsia="Calibri" w:hAnsi="Calibri"/>
-        </w:rPr>
-        <w:t xml:space="preserve">generados, dashboard con KPIs agregados, exportación CSV de reservas, importación CSV en lote con validación fila a fila, albarán A4 imprimible al entregar, y modo oscuro. El backend responde el listado de catálogo en </w:t>
-      </w:r>
-      <w:r>
-        <w:rPr>
-          <w:rFonts w:ascii="Calibri" w:cs="Calibri" w:eastAsia="Calibri" w:hAnsi="Calibri"/>
-          <w:b/>
-          <w:bCs/>
-        </w:rPr>
-        <w:t xml:space="preserve">menos de 200 milisegundos </w:t>
-      </w:r>
-      <w:r>
-        <w:rPr>
-          <w:rFonts w:ascii="Calibri" w:cs="Calibri" w:eastAsia="Calibri" w:hAnsi="Calibri"/>
-        </w:rPr>
-        <w:t xml:space="preserve">con esos 500 productos.</w:t>
+        <w:t xml:space="preserve">El JWT se guarda con EncryptedSharedPreferences cifrado contra el Android Keystore — </w:t>
+      </w:r>
+      <w:r>
+        <w:rPr>
+          <w:rFonts w:ascii="Calibri" w:cs="Calibri" w:eastAsia="Calibri" w:hAnsi="Calibri"/>
+          <w:b/>
+          <w:bCs/>
+        </w:rPr>
+        <w:t xml:space="preserve">nunca se escribe en texto plano. </w:t>
+      </w:r>
+      <w:r>
+        <w:rPr>
+          <w:rFonts w:ascii="Calibri" w:cs="Calibri" w:eastAsia="Calibri" w:hAnsi="Calibri"/>
+        </w:rPr>
+        <w:t xml:space="preserve">La sesión se mantiene entre arranques.</w:t>
       </w:r>
     </w:p>
     <w:p>
@@ -1480,6 +1546,198 @@
           <w:szCs w:val="24"/>
         </w:rPr>
         <w:t xml:space="preserve">Slide 14  ·  </w:t>
+      </w:r>
+      <w:r>
+        <w:rPr>
+          <w:rFonts w:ascii="Calibri" w:cs="Calibri" w:eastAsia="Calibri" w:hAnsi="Calibri"/>
+          <w:b/>
+          <w:bCs/>
+          <w:color w:val="1E2761"/>
+          <w:sz w:val="28"/>
+          <w:szCs w:val="28"/>
+        </w:rPr>
+        <w:t xml:space="preserve">Despliegue</w:t>
+      </w:r>
+      <w:r>
+        <w:rPr>
+          <w:rFonts w:ascii="Calibri" w:cs="Calibri" w:eastAsia="Calibri" w:hAnsi="Calibri"/>
+          <w:color w:val="6B7280"/>
+          <w:sz w:val="20"/>
+          <w:szCs w:val="20"/>
+        </w:rPr>
+        <w:t xml:space="preserve">   —   30 s</w:t>
+      </w:r>
+    </w:p>
+    <w:p>
+      <w:pPr>
+        <w:spacing w:after="120" w:line="300"/>
+      </w:pPr>
+      <w:r>
+        <w:rPr>
+          <w:rFonts w:ascii="Calibri" w:cs="Calibri" w:eastAsia="Calibri" w:hAnsi="Calibri"/>
+        </w:rPr>
+        <w:t xml:space="preserve">El sistema está en producción en </w:t>
+      </w:r>
+      <w:r>
+        <w:rPr>
+          <w:rFonts w:ascii="Calibri" w:cs="Calibri" w:eastAsia="Calibri" w:hAnsi="Calibri"/>
+          <w:b/>
+          <w:bCs/>
+        </w:rPr>
+        <w:t xml:space="preserve">Railway: </w:t>
+      </w:r>
+      <w:r>
+        <w:rPr>
+          <w:rFonts w:ascii="Calibri" w:cs="Calibri" w:eastAsia="Calibri" w:hAnsi="Calibri"/>
+        </w:rPr>
+        <w:t xml:space="preserve">backend Node.js y MySQL gestionado, con HTTPS automático y deploy continuo desde GitHub. Cada push a main dispara un redespliegue. El esquema de base de datos se aplica solo la primera vez —si las tablas están vacías— para que los redespliegues no pisen datos reales.</w:t>
+      </w:r>
+    </w:p>
+    <w:p>
+      <w:pPr>
+        <w:spacing w:after="120" w:before="0" w:line="300"/>
+      </w:pPr>
+      <w:r>
+        <w:rPr>
+          <w:rFonts w:ascii="Calibri" w:cs="Calibri" w:eastAsia="Calibri" w:hAnsi="Calibri"/>
+        </w:rPr>
+        <w:t xml:space="preserve">La URL pública está en la última diapositiva y al final de la demo.</w:t>
+      </w:r>
+    </w:p>
+    <w:p>
+      <w:pPr>
+        <w:pBdr>
+          <w:bottom w:val="single" w:color="1E2761" w:sz="12" w:space="4"/>
+        </w:pBdr>
+        <w:spacing w:after="80" w:before="360"/>
+      </w:pPr>
+      <w:r>
+        <w:rPr>
+          <w:rFonts w:ascii="Calibri" w:cs="Calibri" w:eastAsia="Calibri" w:hAnsi="Calibri"/>
+          <w:b/>
+          <w:bCs/>
+          <w:color w:val="C68A2E"/>
+          <w:sz w:val="24"/>
+          <w:szCs w:val="24"/>
+        </w:rPr>
+        <w:t xml:space="preserve">Slide 15  ·  </w:t>
+      </w:r>
+      <w:r>
+        <w:rPr>
+          <w:rFonts w:ascii="Calibri" w:cs="Calibri" w:eastAsia="Calibri" w:hAnsi="Calibri"/>
+          <w:b/>
+          <w:bCs/>
+          <w:color w:val="1E2761"/>
+          <w:sz w:val="28"/>
+          <w:szCs w:val="28"/>
+        </w:rPr>
+        <w:t xml:space="preserve">Pruebas y resultados</w:t>
+      </w:r>
+      <w:r>
+        <w:rPr>
+          <w:rFonts w:ascii="Calibri" w:cs="Calibri" w:eastAsia="Calibri" w:hAnsi="Calibri"/>
+          <w:color w:val="6B7280"/>
+          <w:sz w:val="20"/>
+          <w:szCs w:val="20"/>
+        </w:rPr>
+        <w:t xml:space="preserve">   —   40 s</w:t>
+      </w:r>
+    </w:p>
+    <w:p>
+      <w:pPr>
+        <w:spacing w:after="120" w:line="300"/>
+      </w:pPr>
+      <w:r>
+        <w:rPr>
+          <w:rFonts w:ascii="Calibri" w:cs="Calibri" w:eastAsia="Calibri" w:hAnsi="Calibri"/>
+        </w:rPr>
+        <w:t xml:space="preserve">Tests automatizados con </w:t>
+      </w:r>
+      <w:r>
+        <w:rPr>
+          <w:rFonts w:ascii="Calibri" w:cs="Calibri" w:eastAsia="Calibri" w:hAnsi="Calibri"/>
+          <w:b/>
+          <w:bCs/>
+        </w:rPr>
+        <w:t xml:space="preserve">Vitest + Supertest </w:t>
+      </w:r>
+      <w:r>
+        <w:rPr>
+          <w:rFonts w:ascii="Calibri" w:cs="Calibri" w:eastAsia="Calibri" w:hAnsi="Calibri"/>
+        </w:rPr>
+        <w:t xml:space="preserve">sobre los flujos críticos: autenticación, CRUD de productos con autorización por rol, y el caso de </w:t>
+      </w:r>
+      <w:r>
+        <w:rPr>
+          <w:rFonts w:ascii="Calibri" w:cs="Calibri" w:eastAsia="Calibri" w:hAnsi="Calibri"/>
+          <w:b/>
+          <w:bCs/>
+        </w:rPr>
+        <w:t xml:space="preserve">concurrencia simulada </w:t>
+      </w:r>
+      <w:r>
+        <w:rPr>
+          <w:rFonts w:ascii="Calibri" w:cs="Calibri" w:eastAsia="Calibri" w:hAnsi="Calibri"/>
+        </w:rPr>
+        <w:t xml:space="preserve">que mencionábamos antes.</w:t>
+      </w:r>
+    </w:p>
+    <w:p>
+      <w:pPr>
+        <w:spacing w:after="120" w:line="300"/>
+      </w:pPr>
+      <w:r>
+        <w:rPr>
+          <w:rFonts w:ascii="Calibri" w:cs="Calibri" w:eastAsia="Calibri" w:hAnsi="Calibri"/>
+        </w:rPr>
+        <w:t xml:space="preserve">Resultado funcional: un catálogo con </w:t>
+      </w:r>
+      <w:r>
+        <w:rPr>
+          <w:rFonts w:ascii="Calibri" w:cs="Calibri" w:eastAsia="Calibri" w:hAnsi="Calibri"/>
+          <w:b/>
+          <w:bCs/>
+        </w:rPr>
+        <w:t xml:space="preserve">500 productos </w:t>
+      </w:r>
+      <w:r>
+        <w:rPr>
+          <w:rFonts w:ascii="Calibri" w:cs="Calibri" w:eastAsia="Calibri" w:hAnsi="Calibri"/>
+        </w:rPr>
+        <w:t xml:space="preserve">generados, dashboard con KPIs agregados, exportación CSV de reservas, importación CSV en lote con validación fila a fila, albarán A4 imprimible al entregar, y modo oscuro. El backend responde el listado de catálogo en </w:t>
+      </w:r>
+      <w:r>
+        <w:rPr>
+          <w:rFonts w:ascii="Calibri" w:cs="Calibri" w:eastAsia="Calibri" w:hAnsi="Calibri"/>
+          <w:b/>
+          <w:bCs/>
+        </w:rPr>
+        <w:t xml:space="preserve">menos de 200 milisegundos </w:t>
+      </w:r>
+      <w:r>
+        <w:rPr>
+          <w:rFonts w:ascii="Calibri" w:cs="Calibri" w:eastAsia="Calibri" w:hAnsi="Calibri"/>
+        </w:rPr>
+        <w:t xml:space="preserve">con esos 500 productos.</w:t>
+      </w:r>
+    </w:p>
+    <w:p>
+      <w:pPr>
+        <w:pBdr>
+          <w:bottom w:val="single" w:color="1E2761" w:sz="12" w:space="4"/>
+        </w:pBdr>
+        <w:spacing w:after="80" w:before="360"/>
+      </w:pPr>
+      <w:r>
+        <w:rPr>
+          <w:rFonts w:ascii="Calibri" w:cs="Calibri" w:eastAsia="Calibri" w:hAnsi="Calibri"/>
+          <w:b/>
+          <w:bCs/>
+          <w:color w:val="C68A2E"/>
+          <w:sz w:val="24"/>
+          <w:szCs w:val="24"/>
+        </w:rPr>
+        <w:t xml:space="preserve">Slide 16  ·  </w:t>
       </w:r>
       <w:r>
         <w:rPr>
@@ -1672,7 +1930,7 @@
           <w:sz w:val="24"/>
           <w:szCs w:val="24"/>
         </w:rPr>
-        <w:t xml:space="preserve">Slide 15  ·  </w:t>
+        <w:t xml:space="preserve">Slide 17  ·  </w:t>
       </w:r>
       <w:r>
         <w:rPr>

</xml_diff>